<commit_message>
Add engineering/architecture deep-dive to Meeting Defense Pack
Co-Authored-By: Claude Opus 4.8 <noreply@anthropic.com>
</commit_message>
<xml_diff>
--- a/AI_DataValidator_Meeting_Defense_Pack.docx
+++ b/AI_DataValidator_Meeting_Defense_Pack.docx
@@ -1213,6 +1213,578 @@
           <w:szCs w:val="21"/>
         </w:rPr>
         <w:t xml:space="preserve">badmouth competitors — acknowledge Duco’s AI lead graciously, differentiate on the combination and mid-market fit.</w:t>
+      </w:r>
+    </w:p>
+    <w:p>
+      <w:pPr>
+        <w:pStyle w:val="Heading1"/>
+        <w:spacing w:after="110" w:before="240"/>
+      </w:pPr>
+      <w:r>
+        <w:rPr>
+          <w:b/>
+          <w:bCs/>
+          <w:color w:val="1F3A5F"/>
+          <w:sz w:val="25"/>
+          <w:szCs w:val="25"/>
+        </w:rPr>
+        <w:t xml:space="preserve">7. Engineering / architecture deep-dive (for the technical drill)</w:t>
+      </w:r>
+    </w:p>
+    <w:p>
+      <w:pPr>
+        <w:spacing w:after="110" w:line="274"/>
+      </w:pPr>
+      <w:r>
+        <w:rPr>
+          <w:b/>
+          <w:bCs/>
+          <w:color w:val="222222"/>
+          <w:sz w:val="21"/>
+          <w:szCs w:val="21"/>
+        </w:rPr>
+        <w:t xml:space="preserve">Stack: </w:t>
+      </w:r>
+      <w:r>
+        <w:rPr>
+          <w:color w:val="222222"/>
+          <w:sz w:val="21"/>
+          <w:szCs w:val="21"/>
+        </w:rPr>
+        <w:t xml:space="preserve">Python / FastAPI backend; provider SDKs (OpenAI-compatible for Groq/OpenRouter/OpenAI, native for Gemini/Anthropic, boto3 for Bedrock); pandas/NumPy deterministic engine; fastembed (ONNX) for local embeddings.</w:t>
+      </w:r>
+    </w:p>
+    <w:p>
+      <w:pPr>
+        <w:spacing w:after="110" w:line="274"/>
+      </w:pPr>
+      <w:r>
+        <w:rPr>
+          <w:b/>
+          <w:bCs/>
+          <w:color w:val="222222"/>
+          <w:sz w:val="21"/>
+          <w:szCs w:val="21"/>
+        </w:rPr>
+        <w:t xml:space="preserve">Agent framework: </w:t>
+      </w:r>
+      <w:r>
+        <w:rPr>
+          <w:color w:val="222222"/>
+          <w:sz w:val="21"/>
+          <w:szCs w:val="21"/>
+        </w:rPr>
+        <w:t xml:space="preserve">a deliberately </w:t>
+      </w:r>
+      <w:r>
+        <w:rPr>
+          <w:b/>
+          <w:bCs/>
+          <w:color w:val="222222"/>
+          <w:sz w:val="21"/>
+          <w:szCs w:val="21"/>
+        </w:rPr>
+        <w:t xml:space="preserve">custom, lightweight tool-calling loop</w:t>
+      </w:r>
+      <w:r>
+        <w:rPr>
+          <w:color w:val="222222"/>
+          <w:sz w:val="21"/>
+          <w:szCs w:val="21"/>
+        </w:rPr>
+        <w:t xml:space="preserve"> (~60 lines) over OpenAI-compatible function-calling — not a heavyweight framework. Chosen for full control of the loop/prompts/safety, auditability, and minimal dependencies — which matter for regulated use.</w:t>
+      </w:r>
+    </w:p>
+    <w:p>
+      <w:pPr>
+        <w:spacing w:after="40" w:before="150"/>
+      </w:pPr>
+      <w:r>
+        <w:rPr>
+          <w:b/>
+          <w:bCs/>
+          <w:color w:val="2563EB"/>
+          <w:sz w:val="21"/>
+          <w:szCs w:val="21"/>
+        </w:rPr>
+        <w:t xml:space="preserve">Q  </w:t>
+      </w:r>
+      <w:r>
+        <w:rPr>
+          <w:b/>
+          <w:bCs/>
+          <w:color w:val="1F3A5F"/>
+          <w:sz w:val="21"/>
+          <w:szCs w:val="21"/>
+        </w:rPr>
+        <w:t xml:space="preserve">What framework — LangChain / LlamaIndex?</w:t>
+      </w:r>
+    </w:p>
+    <w:p>
+      <w:pPr>
+        <w:spacing w:after="90" w:line="274"/>
+        <w:ind w:left="220"/>
+      </w:pPr>
+      <w:r>
+        <w:rPr>
+          <w:b/>
+          <w:bCs/>
+          <w:color w:val="15803D"/>
+          <w:sz w:val="21"/>
+          <w:szCs w:val="21"/>
+        </w:rPr>
+        <w:t xml:space="preserve">A  </w:t>
+      </w:r>
+      <w:r>
+        <w:rPr>
+          <w:color w:val="222222"/>
+          <w:sz w:val="21"/>
+          <w:szCs w:val="21"/>
+        </w:rPr>
+        <w:t xml:space="preserve">A purpose-built tool-calling loop, intentionally. Heavyweight agent frameworks add hidden abstractions and dependencies we would have to audit for a regulated deployment. We use provider SDKs directly and control the loop ourselves — full transparency over exactly what the model sees and does.</w:t>
+      </w:r>
+    </w:p>
+    <w:p>
+      <w:pPr>
+        <w:spacing w:after="40" w:before="150"/>
+      </w:pPr>
+      <w:r>
+        <w:rPr>
+          <w:b/>
+          <w:bCs/>
+          <w:color w:val="2563EB"/>
+          <w:sz w:val="21"/>
+          <w:szCs w:val="21"/>
+        </w:rPr>
+        <w:t xml:space="preserve">Q  </w:t>
+      </w:r>
+      <w:r>
+        <w:rPr>
+          <w:b/>
+          <w:bCs/>
+          <w:color w:val="1F3A5F"/>
+          <w:sz w:val="21"/>
+          <w:szCs w:val="21"/>
+        </w:rPr>
+        <w:t xml:space="preserve">Describe the agent design.</w:t>
+      </w:r>
+    </w:p>
+    <w:p>
+      <w:pPr>
+        <w:spacing w:after="90" w:line="274"/>
+        <w:ind w:left="220"/>
+      </w:pPr>
+      <w:r>
+        <w:rPr>
+          <w:b/>
+          <w:bCs/>
+          <w:color w:val="15803D"/>
+          <w:sz w:val="21"/>
+          <w:szCs w:val="21"/>
+        </w:rPr>
+        <w:t xml:space="preserve">A  </w:t>
+      </w:r>
+      <w:r>
+        <w:rPr>
+          <w:color w:val="222222"/>
+          <w:sz w:val="21"/>
+          <w:szCs w:val="21"/>
+        </w:rPr>
+        <w:t xml:space="preserve">A bounded, ReAct-style loop: system prompt + history + user message → the model emits tool calls → we execute them → feed results back → repeat, </w:t>
+      </w:r>
+      <w:r>
+        <w:rPr>
+          <w:b/>
+          <w:bCs/>
+          <w:color w:val="222222"/>
+          <w:sz w:val="21"/>
+          <w:szCs w:val="21"/>
+        </w:rPr>
+        <w:t xml:space="preserve">capped at 8 iterations</w:t>
+      </w:r>
+      <w:r>
+        <w:rPr>
+          <w:color w:val="222222"/>
+          <w:sz w:val="21"/>
+          <w:szCs w:val="21"/>
+        </w:rPr>
+        <w:t xml:space="preserve">. Six tools, all </w:t>
+      </w:r>
+      <w:r>
+        <w:rPr>
+          <w:b/>
+          <w:bCs/>
+          <w:color w:val="222222"/>
+          <w:sz w:val="21"/>
+          <w:szCs w:val="21"/>
+        </w:rPr>
+        <w:t xml:space="preserve">read-only over the session’s already-computed results</w:t>
+      </w:r>
+      <w:r>
+        <w:rPr>
+          <w:color w:val="222222"/>
+          <w:sz w:val="21"/>
+          <w:szCs w:val="21"/>
+        </w:rPr>
+        <w:t xml:space="preserve"> (compare, quality, mapping, governance, lineage, reference-doc search). The agent inspects deterministic results — it cannot mutate data or run arbitrary analysis. Tool outputs are field-whitelisted before returning to the model (data minimisation).</w:t>
+      </w:r>
+    </w:p>
+    <w:p>
+      <w:pPr>
+        <w:spacing w:after="40" w:before="150"/>
+      </w:pPr>
+      <w:r>
+        <w:rPr>
+          <w:b/>
+          <w:bCs/>
+          <w:color w:val="2563EB"/>
+          <w:sz w:val="21"/>
+          <w:szCs w:val="21"/>
+        </w:rPr>
+        <w:t xml:space="preserve">Q  </w:t>
+      </w:r>
+      <w:r>
+        <w:rPr>
+          <w:b/>
+          <w:bCs/>
+          <w:color w:val="1F3A5F"/>
+          <w:sz w:val="21"/>
+          <w:szCs w:val="21"/>
+        </w:rPr>
+        <w:t xml:space="preserve">How does plain English become an executable rule?</w:t>
+      </w:r>
+    </w:p>
+    <w:p>
+      <w:pPr>
+        <w:spacing w:after="90" w:line="274"/>
+        <w:ind w:left="220"/>
+      </w:pPr>
+      <w:r>
+        <w:rPr>
+          <w:b/>
+          <w:bCs/>
+          <w:color w:val="15803D"/>
+          <w:sz w:val="21"/>
+          <w:szCs w:val="21"/>
+        </w:rPr>
+        <w:t xml:space="preserve">A  </w:t>
+      </w:r>
+      <w:r>
+        <w:rPr>
+          <w:color w:val="222222"/>
+          <w:sz w:val="21"/>
+          <w:szCs w:val="21"/>
+        </w:rPr>
+        <w:t xml:space="preserve">Constrained generation: a structured LLM call converts the instruction into </w:t>
+      </w:r>
+      <w:r>
+        <w:rPr>
+          <w:b/>
+          <w:bCs/>
+          <w:color w:val="222222"/>
+          <w:sz w:val="21"/>
+          <w:szCs w:val="21"/>
+        </w:rPr>
+        <w:t xml:space="preserve">strict JSON parameters</w:t>
+      </w:r>
+      <w:r>
+        <w:rPr>
+          <w:color w:val="222222"/>
+          <w:sz w:val="21"/>
+          <w:szCs w:val="21"/>
+        </w:rPr>
+        <w:t xml:space="preserve"> (keys, transforms, tolerances, combine/coalesce/computed columns). The JSON is schema-validated, prompt-versioned and cached, then executed by the deterministic engine. The LLM is the </w:t>
+      </w:r>
+      <w:r>
+        <w:rPr>
+          <w:b/>
+          <w:bCs/>
+          <w:color w:val="222222"/>
+          <w:sz w:val="21"/>
+          <w:szCs w:val="21"/>
+        </w:rPr>
+        <w:t xml:space="preserve">compiler front-end (intent → validated rules)</w:t>
+      </w:r>
+      <w:r>
+        <w:rPr>
+          <w:color w:val="222222"/>
+          <w:sz w:val="21"/>
+          <w:szCs w:val="21"/>
+        </w:rPr>
+        <w:t xml:space="preserve">; the engine is the runtime. The model is never in the data path for computation.</w:t>
+      </w:r>
+    </w:p>
+    <w:p>
+      <w:pPr>
+        <w:spacing w:after="40" w:before="150"/>
+      </w:pPr>
+      <w:r>
+        <w:rPr>
+          <w:b/>
+          <w:bCs/>
+          <w:color w:val="2563EB"/>
+          <w:sz w:val="21"/>
+          <w:szCs w:val="21"/>
+        </w:rPr>
+        <w:t xml:space="preserve">Q  </w:t>
+      </w:r>
+      <w:r>
+        <w:rPr>
+          <w:b/>
+          <w:bCs/>
+          <w:color w:val="1F3A5F"/>
+          <w:sz w:val="21"/>
+          <w:szCs w:val="21"/>
+        </w:rPr>
+        <w:t xml:space="preserve">Retrieval / RAG?</w:t>
+      </w:r>
+    </w:p>
+    <w:p>
+      <w:pPr>
+        <w:spacing w:after="90" w:line="274"/>
+        <w:ind w:left="220"/>
+      </w:pPr>
+      <w:r>
+        <w:rPr>
+          <w:b/>
+          <w:bCs/>
+          <w:color w:val="15803D"/>
+          <w:sz w:val="21"/>
+          <w:szCs w:val="21"/>
+        </w:rPr>
+        <w:t xml:space="preserve">A  </w:t>
+      </w:r>
+      <w:r>
+        <w:rPr>
+          <w:color w:val="222222"/>
+          <w:sz w:val="21"/>
+          <w:szCs w:val="21"/>
+        </w:rPr>
+        <w:t xml:space="preserve">Hybrid: keyword/term-frequency plus </w:t>
+      </w:r>
+      <w:r>
+        <w:rPr>
+          <w:b/>
+          <w:bCs/>
+          <w:color w:val="222222"/>
+          <w:sz w:val="21"/>
+          <w:szCs w:val="21"/>
+        </w:rPr>
+        <w:t xml:space="preserve">local ONNX embeddings</w:t>
+      </w:r>
+      <w:r>
+        <w:rPr>
+          <w:color w:val="222222"/>
+          <w:sz w:val="21"/>
+          <w:szCs w:val="21"/>
+        </w:rPr>
+        <w:t xml:space="preserve"> (fastembed, bge-small) with an in-memory cosine index, content-hash cached, graceful fallback to keyword. No vector database (right-sized for per-session reference docs) and no embedding API (so document text never leaves the server).</w:t>
+      </w:r>
+    </w:p>
+    <w:p>
+      <w:pPr>
+        <w:spacing w:after="40" w:before="150"/>
+      </w:pPr>
+      <w:r>
+        <w:rPr>
+          <w:b/>
+          <w:bCs/>
+          <w:color w:val="2563EB"/>
+          <w:sz w:val="21"/>
+          <w:szCs w:val="21"/>
+        </w:rPr>
+        <w:t xml:space="preserve">Q  </w:t>
+      </w:r>
+      <w:r>
+        <w:rPr>
+          <w:b/>
+          <w:bCs/>
+          <w:color w:val="1F3A5F"/>
+          <w:sz w:val="21"/>
+          <w:szCs w:val="21"/>
+        </w:rPr>
+        <w:t xml:space="preserve">Memory / how does it 'learn'?</w:t>
+      </w:r>
+    </w:p>
+    <w:p>
+      <w:pPr>
+        <w:spacing w:after="90" w:line="274"/>
+        <w:ind w:left="220"/>
+      </w:pPr>
+      <w:r>
+        <w:rPr>
+          <w:b/>
+          <w:bCs/>
+          <w:color w:val="15803D"/>
+          <w:sz w:val="21"/>
+          <w:szCs w:val="21"/>
+        </w:rPr>
+        <w:t xml:space="preserve">A  </w:t>
+      </w:r>
+      <w:r>
+        <w:rPr>
+          <w:color w:val="222222"/>
+          <w:sz w:val="21"/>
+          <w:szCs w:val="21"/>
+        </w:rPr>
+        <w:t xml:space="preserve">Two tiers: short-term windowed conversation history, and long-term </w:t>
+      </w:r>
+      <w:r>
+        <w:rPr>
+          <w:b/>
+          <w:bCs/>
+          <w:color w:val="222222"/>
+          <w:sz w:val="21"/>
+          <w:szCs w:val="21"/>
+        </w:rPr>
+        <w:t xml:space="preserve">Dataset Memory</w:t>
+      </w:r>
+      <w:r>
+        <w:rPr>
+          <w:color w:val="222222"/>
+          <w:sz w:val="21"/>
+          <w:szCs w:val="21"/>
+        </w:rPr>
+        <w:t xml:space="preserve"> — persistent, per-schema-fingerprint rules that are retrieved and auto-applied on matching datasets. It is retrieval-augmented rule application — inspectable and deterministic — </w:t>
+      </w:r>
+      <w:r>
+        <w:rPr>
+          <w:b/>
+          <w:bCs/>
+          <w:color w:val="222222"/>
+          <w:sz w:val="21"/>
+          <w:szCs w:val="21"/>
+        </w:rPr>
+        <w:t xml:space="preserve">not model fine-tuning</w:t>
+      </w:r>
+      <w:r>
+        <w:rPr>
+          <w:color w:val="222222"/>
+          <w:sz w:val="21"/>
+          <w:szCs w:val="21"/>
+        </w:rPr>
+        <w:t xml:space="preserve">, so there is no training-data leakage or drift risk.</w:t>
+      </w:r>
+    </w:p>
+    <w:p>
+      <w:pPr>
+        <w:spacing w:after="40" w:before="150"/>
+      </w:pPr>
+      <w:r>
+        <w:rPr>
+          <w:b/>
+          <w:bCs/>
+          <w:color w:val="2563EB"/>
+          <w:sz w:val="21"/>
+          <w:szCs w:val="21"/>
+        </w:rPr>
+        <w:t xml:space="preserve">Q  </w:t>
+      </w:r>
+      <w:r>
+        <w:rPr>
+          <w:b/>
+          <w:bCs/>
+          <w:color w:val="1F3A5F"/>
+          <w:sz w:val="21"/>
+          <w:szCs w:val="21"/>
+        </w:rPr>
+        <w:t xml:space="preserve">Model orchestration &amp; resilience?</w:t>
+      </w:r>
+    </w:p>
+    <w:p>
+      <w:pPr>
+        <w:spacing w:after="90" w:line="274"/>
+        <w:ind w:left="220"/>
+      </w:pPr>
+      <w:r>
+        <w:rPr>
+          <w:b/>
+          <w:bCs/>
+          <w:color w:val="15803D"/>
+          <w:sz w:val="21"/>
+          <w:szCs w:val="21"/>
+        </w:rPr>
+        <w:t xml:space="preserve">A  </w:t>
+      </w:r>
+      <w:r>
+        <w:rPr>
+          <w:color w:val="222222"/>
+          <w:sz w:val="21"/>
+          <w:szCs w:val="21"/>
+        </w:rPr>
+        <w:t xml:space="preserve">A provider-agnostic factory with automatic fallback (Groq → OpenRouter → Gemini → Bedrock → OpenAI → Anthropic), low temperature and token caps for determinism/cost, and a governed order (DPA_ONLY) that filters to DPA providers for regulated data.</w:t>
+      </w:r>
+    </w:p>
+    <w:p>
+      <w:pPr>
+        <w:spacing w:after="40" w:before="150"/>
+      </w:pPr>
+      <w:r>
+        <w:rPr>
+          <w:b/>
+          <w:bCs/>
+          <w:color w:val="2563EB"/>
+          <w:sz w:val="21"/>
+          <w:szCs w:val="21"/>
+        </w:rPr>
+        <w:t xml:space="preserve">Q  </w:t>
+      </w:r>
+      <w:r>
+        <w:rPr>
+          <w:b/>
+          <w:bCs/>
+          <w:color w:val="1F3A5F"/>
+          <w:sz w:val="21"/>
+          <w:szCs w:val="21"/>
+        </w:rPr>
+        <w:t xml:space="preserve">Engineering guardrails?</w:t>
+      </w:r>
+    </w:p>
+    <w:p>
+      <w:pPr>
+        <w:spacing w:after="90" w:line="274"/>
+        <w:ind w:left="220"/>
+      </w:pPr>
+      <w:r>
+        <w:rPr>
+          <w:b/>
+          <w:bCs/>
+          <w:color w:val="15803D"/>
+          <w:sz w:val="21"/>
+          <w:szCs w:val="21"/>
+        </w:rPr>
+        <w:t xml:space="preserve">A  </w:t>
+      </w:r>
+      <w:r>
+        <w:rPr>
+          <w:color w:val="222222"/>
+          <w:sz w:val="21"/>
+          <w:szCs w:val="21"/>
+        </w:rPr>
+        <w:t xml:space="preserve">AST-whitelisted arithmetic (no eval/exec), PII masking before any model call, bounded iterations, read-only tools, prompt versioning + response caching for reproducibility, and a deterministic engine as the sole computer of numbers with all model output validated as JSON before execution.</w:t>
+      </w:r>
+    </w:p>
+    <w:p>
+      <w:pPr>
+        <w:spacing w:after="110" w:line="274"/>
+      </w:pPr>
+      <w:r>
+        <w:rPr>
+          <w:b/>
+          <w:bCs/>
+          <w:color w:val="222222"/>
+          <w:sz w:val="21"/>
+          <w:szCs w:val="21"/>
+        </w:rPr>
+        <w:t xml:space="preserve">The line for a technical audience: </w:t>
+      </w:r>
+      <w:r>
+        <w:rPr>
+          <w:color w:val="222222"/>
+          <w:sz w:val="21"/>
+          <w:szCs w:val="21"/>
+        </w:rPr>
+        <w:t xml:space="preserve">“The LLM is a compiler front-end that turns intent into validated rules; our deterministic engine is the runtime that executes them. The model is never in the computation path.”</w:t>
       </w:r>
     </w:p>
     <w:p>

</xml_diff>